<commit_message>
corrected clustering and fixed effects variables
</commit_message>
<xml_diff>
--- a/results/04_democrats.docx
+++ b/results/04_democrats.docx
@@ -5,18 +5,18 @@
     <w:tbl>
       <w:tblPr>
         <w:tblStyle w:val="Table"/>
-        <w:tblW w:type="pct" w:w="4846"/>
+        <w:tblW w:type="pct" w:w="4850"/>
         <w:tblLayout w:type="fixed"/>
         <w:tblLook w:firstRow="1" w:lastRow="1" w:firstColumn="0" w:lastColumn="0" w:noHBand="0" w:noVBand="0" w:val="0020"/>
       </w:tblPr>
       <w:tblGrid>
-        <w:gridCol w:w="2640"/>
-        <w:gridCol w:w="831"/>
-        <w:gridCol w:w="782"/>
-        <w:gridCol w:w="831"/>
-        <w:gridCol w:w="880"/>
-        <w:gridCol w:w="880"/>
-        <w:gridCol w:w="831"/>
+        <w:gridCol w:w="2560"/>
+        <w:gridCol w:w="806"/>
+        <w:gridCol w:w="806"/>
+        <w:gridCol w:w="853"/>
+        <w:gridCol w:w="901"/>
+        <w:gridCol w:w="948"/>
+        <w:gridCol w:w="806"/>
       </w:tblGrid>
       <w:tr>
         <w:trPr>
@@ -35,7 +35,6 @@
           <w:p>
             <w:pPr>
               <w:pStyle w:val="Compact"/>
-              <w:jc w:val="left"/>
             </w:pPr>
             <w:r>
               <w:t xml:space="preserve">Trust H1</w:t>
@@ -47,7 +46,6 @@
           <w:p>
             <w:pPr>
               <w:pStyle w:val="Compact"/>
-              <w:jc w:val="left"/>
             </w:pPr>
             <w:r>
               <w:t xml:space="preserve">Feel H2</w:t>
@@ -59,7 +57,6 @@
           <w:p>
             <w:pPr>
               <w:pStyle w:val="Compact"/>
-              <w:jc w:val="left"/>
             </w:pPr>
             <w:r>
               <w:t xml:space="preserve">Trust H3a</w:t>
@@ -71,7 +68,6 @@
           <w:p>
             <w:pPr>
               <w:pStyle w:val="Compact"/>
-              <w:jc w:val="left"/>
             </w:pPr>
             <w:r>
               <w:t xml:space="preserve">Feel H3b</w:t>
@@ -83,7 +79,6 @@
           <w:p>
             <w:pPr>
               <w:pStyle w:val="Compact"/>
-              <w:jc w:val="left"/>
             </w:pPr>
             <w:r>
               <w:t xml:space="preserve">Trust H4a</w:t>
@@ -95,7 +90,6 @@
           <w:p>
             <w:pPr>
               <w:pStyle w:val="Compact"/>
-              <w:jc w:val="left"/>
             </w:pPr>
             <w:r>
               <w:t xml:space="preserve">Feel H4b</w:t>
@@ -109,7 +103,6 @@
           <w:p>
             <w:pPr>
               <w:pStyle w:val="Compact"/>
-              <w:jc w:val="left"/>
             </w:pPr>
             <w:r>
               <w:t xml:space="preserve">Facial_Cuenegative</w:t>
@@ -121,70 +114,64 @@
           <w:p>
             <w:pPr>
               <w:pStyle w:val="Compact"/>
-              <w:jc w:val="left"/>
-            </w:pPr>
-            <w:r>
-              <w:t xml:space="preserve">-0.010 (0.019)</w:t>
-            </w:r>
-          </w:p>
-        </w:tc>
-        <w:tc>
-          <w:tcPr/>
-          <w:p>
-            <w:pPr>
-              <w:pStyle w:val="Compact"/>
-              <w:jc w:val="left"/>
-            </w:pPr>
-            <w:r>
-              <w:t xml:space="preserve">0.014 (0.017)</w:t>
-            </w:r>
-          </w:p>
-        </w:tc>
-        <w:tc>
-          <w:tcPr/>
-          <w:p>
-            <w:pPr>
-              <w:pStyle w:val="Compact"/>
-              <w:jc w:val="left"/>
-            </w:pPr>
-            <w:r>
-              <w:t xml:space="preserve">-0.015 (0.019)</w:t>
-            </w:r>
-          </w:p>
-        </w:tc>
-        <w:tc>
-          <w:tcPr/>
-          <w:p>
-            <w:pPr>
-              <w:pStyle w:val="Compact"/>
-              <w:jc w:val="left"/>
-            </w:pPr>
-            <w:r>
-              <w:t xml:space="preserve">0.012 (0.017)</w:t>
-            </w:r>
-          </w:p>
-        </w:tc>
-        <w:tc>
-          <w:tcPr/>
-          <w:p>
-            <w:pPr>
-              <w:pStyle w:val="Compact"/>
-              <w:jc w:val="left"/>
-            </w:pPr>
-            <w:r>
-              <w:t xml:space="preserve">-0.036 (0.013)</w:t>
-            </w:r>
-          </w:p>
-        </w:tc>
-        <w:tc>
-          <w:tcPr/>
-          <w:p>
-            <w:pPr>
-              <w:pStyle w:val="Compact"/>
-              <w:jc w:val="left"/>
-            </w:pPr>
-            <w:r>
-              <w:t xml:space="preserve">0.007 (0.029)</w:t>
+            </w:pPr>
+            <w:r>
+              <w:t xml:space="preserve">-0.010 (0.017)</w:t>
+            </w:r>
+          </w:p>
+        </w:tc>
+        <w:tc>
+          <w:tcPr/>
+          <w:p>
+            <w:pPr>
+              <w:pStyle w:val="Compact"/>
+            </w:pPr>
+            <w:r>
+              <w:t xml:space="preserve">0.014 (0.019)</w:t>
+            </w:r>
+          </w:p>
+        </w:tc>
+        <w:tc>
+          <w:tcPr/>
+          <w:p>
+            <w:pPr>
+              <w:pStyle w:val="Compact"/>
+            </w:pPr>
+            <w:r>
+              <w:t xml:space="preserve">-0.015 (0.029)</w:t>
+            </w:r>
+          </w:p>
+        </w:tc>
+        <w:tc>
+          <w:tcPr/>
+          <w:p>
+            <w:pPr>
+              <w:pStyle w:val="Compact"/>
+            </w:pPr>
+            <w:r>
+              <w:t xml:space="preserve">0.012 (0.034)</w:t>
+            </w:r>
+          </w:p>
+        </w:tc>
+        <w:tc>
+          <w:tcPr/>
+          <w:p>
+            <w:pPr>
+              <w:pStyle w:val="Compact"/>
+            </w:pPr>
+            <w:r>
+              <w:t xml:space="preserve">-0.036 (0.029)</w:t>
+            </w:r>
+          </w:p>
+        </w:tc>
+        <w:tc>
+          <w:tcPr/>
+          <w:p>
+            <w:pPr>
+              <w:pStyle w:val="Compact"/>
+            </w:pPr>
+            <w:r>
+              <w:t xml:space="preserve">0.007 (0.035)</w:t>
             </w:r>
           </w:p>
         </w:tc>
@@ -195,7 +182,6 @@
           <w:p>
             <w:pPr>
               <w:pStyle w:val="Compact"/>
-              <w:jc w:val="left"/>
             </w:pPr>
             <w:r>
               <w:t xml:space="preserve">Facial_Cuepositive</w:t>
@@ -207,70 +193,64 @@
           <w:p>
             <w:pPr>
               <w:pStyle w:val="Compact"/>
-              <w:jc w:val="left"/>
-            </w:pPr>
-            <w:r>
-              <w:t xml:space="preserve">0.017 (0.023)</w:t>
-            </w:r>
-          </w:p>
-        </w:tc>
-        <w:tc>
-          <w:tcPr/>
-          <w:p>
-            <w:pPr>
-              <w:pStyle w:val="Compact"/>
-              <w:jc w:val="left"/>
-            </w:pPr>
-            <w:r>
-              <w:t xml:space="preserve">0.040 (0.015)</w:t>
-            </w:r>
-          </w:p>
-        </w:tc>
-        <w:tc>
-          <w:tcPr/>
-          <w:p>
-            <w:pPr>
-              <w:pStyle w:val="Compact"/>
-              <w:jc w:val="left"/>
-            </w:pPr>
-            <w:r>
-              <w:t xml:space="preserve">-0.057 (0.021)</w:t>
-            </w:r>
-          </w:p>
-        </w:tc>
-        <w:tc>
-          <w:tcPr/>
-          <w:p>
-            <w:pPr>
-              <w:pStyle w:val="Compact"/>
-              <w:jc w:val="left"/>
-            </w:pPr>
-            <w:r>
-              <w:t xml:space="preserve">0.034* (0.005)</w:t>
-            </w:r>
-          </w:p>
-        </w:tc>
-        <w:tc>
-          <w:tcPr/>
-          <w:p>
-            <w:pPr>
-              <w:pStyle w:val="Compact"/>
-              <w:jc w:val="left"/>
-            </w:pPr>
-            <w:r>
-              <w:t xml:space="preserve">0.001 (0.015)</w:t>
-            </w:r>
-          </w:p>
-        </w:tc>
-        <w:tc>
-          <w:tcPr/>
-          <w:p>
-            <w:pPr>
-              <w:pStyle w:val="Compact"/>
-              <w:jc w:val="left"/>
-            </w:pPr>
-            <w:r>
-              <w:t xml:space="preserve">0.085* (0.019)</w:t>
+            </w:pPr>
+            <w:r>
+              <w:t xml:space="preserve">0.017 (0.017)</w:t>
+            </w:r>
+          </w:p>
+        </w:tc>
+        <w:tc>
+          <w:tcPr/>
+          <w:p>
+            <w:pPr>
+              <w:pStyle w:val="Compact"/>
+            </w:pPr>
+            <w:r>
+              <w:t xml:space="preserve">0.040* (0.018)</w:t>
+            </w:r>
+          </w:p>
+        </w:tc>
+        <w:tc>
+          <w:tcPr/>
+          <w:p>
+            <w:pPr>
+              <w:pStyle w:val="Compact"/>
+            </w:pPr>
+            <w:r>
+              <w:t xml:space="preserve">-0.057 (0.031)</w:t>
+            </w:r>
+          </w:p>
+        </w:tc>
+        <w:tc>
+          <w:tcPr/>
+          <w:p>
+            <w:pPr>
+              <w:pStyle w:val="Compact"/>
+            </w:pPr>
+            <w:r>
+              <w:t xml:space="preserve">0.034 (0.035)</w:t>
+            </w:r>
+          </w:p>
+        </w:tc>
+        <w:tc>
+          <w:tcPr/>
+          <w:p>
+            <w:pPr>
+              <w:pStyle w:val="Compact"/>
+            </w:pPr>
+            <w:r>
+              <w:t xml:space="preserve">0.001 (0.027)</w:t>
+            </w:r>
+          </w:p>
+        </w:tc>
+        <w:tc>
+          <w:tcPr/>
+          <w:p>
+            <w:pPr>
+              <w:pStyle w:val="Compact"/>
+            </w:pPr>
+            <w:r>
+              <w:t xml:space="preserve">0.085* (0.033)</w:t>
             </w:r>
           </w:p>
         </w:tc>
@@ -281,7 +261,6 @@
           <w:p>
             <w:pPr>
               <w:pStyle w:val="Compact"/>
-              <w:jc w:val="left"/>
             </w:pPr>
             <w:r>
               <w:t xml:space="preserve">Elite_InPartyTRUE</w:t>
@@ -309,22 +288,20 @@
           <w:p>
             <w:pPr>
               <w:pStyle w:val="Compact"/>
-              <w:jc w:val="left"/>
-            </w:pPr>
-            <w:r>
-              <w:t xml:space="preserve">-0.013 (0.021)</w:t>
-            </w:r>
-          </w:p>
-        </w:tc>
-        <w:tc>
-          <w:tcPr/>
-          <w:p>
-            <w:pPr>
-              <w:pStyle w:val="Compact"/>
-              <w:jc w:val="left"/>
-            </w:pPr>
-            <w:r>
-              <w:t xml:space="preserve">0.403** (0.021)</w:t>
+            </w:pPr>
+            <w:r>
+              <w:t xml:space="preserve">-0.013 (0.027)</w:t>
+            </w:r>
+          </w:p>
+        </w:tc>
+        <w:tc>
+          <w:tcPr/>
+          <w:p>
+            <w:pPr>
+              <w:pStyle w:val="Compact"/>
+            </w:pPr>
+            <w:r>
+              <w:t xml:space="preserve">0.403*** (0.034)</w:t>
             </w:r>
           </w:p>
         </w:tc>
@@ -351,7 +328,6 @@
           <w:p>
             <w:pPr>
               <w:pStyle w:val="Compact"/>
-              <w:jc w:val="left"/>
             </w:pPr>
             <w:r>
               <w:t xml:space="preserve">Facial_Cuenegative × Elite_InPartyTRUE</w:t>
@@ -379,22 +355,20 @@
           <w:p>
             <w:pPr>
               <w:pStyle w:val="Compact"/>
-              <w:jc w:val="left"/>
-            </w:pPr>
-            <w:r>
-              <w:t xml:space="preserve">0.002 (0.038)</w:t>
-            </w:r>
-          </w:p>
-        </w:tc>
-        <w:tc>
-          <w:tcPr/>
-          <w:p>
-            <w:pPr>
-              <w:pStyle w:val="Compact"/>
-              <w:jc w:val="left"/>
-            </w:pPr>
-            <w:r>
-              <w:t xml:space="preserve">0.001 (0.019)</w:t>
+            </w:pPr>
+            <w:r>
+              <w:t xml:space="preserve">0.002 (0.041)</w:t>
+            </w:r>
+          </w:p>
+        </w:tc>
+        <w:tc>
+          <w:tcPr/>
+          <w:p>
+            <w:pPr>
+              <w:pStyle w:val="Compact"/>
+            </w:pPr>
+            <w:r>
+              <w:t xml:space="preserve">0.001 (0.047)</w:t>
             </w:r>
           </w:p>
         </w:tc>
@@ -421,7 +395,6 @@
           <w:p>
             <w:pPr>
               <w:pStyle w:val="Compact"/>
-              <w:jc w:val="left"/>
             </w:pPr>
             <w:r>
               <w:t xml:space="preserve">Facial_Cuepositive × Elite_InPartyTRUE</w:t>
@@ -449,22 +422,20 @@
           <w:p>
             <w:pPr>
               <w:pStyle w:val="Compact"/>
-              <w:jc w:val="left"/>
-            </w:pPr>
-            <w:r>
-              <w:t xml:space="preserve">0.129* (0.015)</w:t>
-            </w:r>
-          </w:p>
-        </w:tc>
-        <w:tc>
-          <w:tcPr/>
-          <w:p>
-            <w:pPr>
-              <w:pStyle w:val="Compact"/>
-              <w:jc w:val="left"/>
-            </w:pPr>
-            <w:r>
-              <w:t xml:space="preserve">0.030 (0.020)</w:t>
+            </w:pPr>
+            <w:r>
+              <w:t xml:space="preserve">0.129** (0.041)</w:t>
+            </w:r>
+          </w:p>
+        </w:tc>
+        <w:tc>
+          <w:tcPr/>
+          <w:p>
+            <w:pPr>
+              <w:pStyle w:val="Compact"/>
+            </w:pPr>
+            <w:r>
+              <w:t xml:space="preserve">0.030 (0.048)</w:t>
             </w:r>
           </w:p>
         </w:tc>
@@ -491,7 +462,6 @@
           <w:p>
             <w:pPr>
               <w:pStyle w:val="Compact"/>
-              <w:jc w:val="left"/>
             </w:pPr>
             <w:r>
               <w:t xml:space="preserve">News_BiasBiasedAgainstInParty</w:t>
@@ -535,22 +505,20 @@
           <w:p>
             <w:pPr>
               <w:pStyle w:val="Compact"/>
-              <w:jc w:val="left"/>
-            </w:pPr>
-            <w:r>
-              <w:t xml:space="preserve">-0.209* (0.021)</w:t>
-            </w:r>
-          </w:p>
-        </w:tc>
-        <w:tc>
-          <w:tcPr/>
-          <w:p>
-            <w:pPr>
-              <w:pStyle w:val="Compact"/>
-              <w:jc w:val="left"/>
-            </w:pPr>
-            <w:r>
-              <w:t xml:space="preserve">0.014 (0.052)</w:t>
+            </w:pPr>
+            <w:r>
+              <w:t xml:space="preserve">-0.209*** (0.042)</w:t>
+            </w:r>
+          </w:p>
+        </w:tc>
+        <w:tc>
+          <w:tcPr/>
+          <w:p>
+            <w:pPr>
+              <w:pStyle w:val="Compact"/>
+            </w:pPr>
+            <w:r>
+              <w:t xml:space="preserve">0.014 (0.048)</w:t>
             </w:r>
           </w:p>
         </w:tc>
@@ -561,7 +529,6 @@
           <w:p>
             <w:pPr>
               <w:pStyle w:val="Compact"/>
-              <w:jc w:val="left"/>
             </w:pPr>
             <w:r>
               <w:t xml:space="preserve">News_BiasBiasedAgainstOutParty</w:t>
@@ -605,7 +572,6 @@
           <w:p>
             <w:pPr>
               <w:pStyle w:val="Compact"/>
-              <w:jc w:val="left"/>
             </w:pPr>
             <w:r>
               <w:t xml:space="preserve">0.060 (0.037)</w:t>
@@ -617,10 +583,9 @@
           <w:p>
             <w:pPr>
               <w:pStyle w:val="Compact"/>
-              <w:jc w:val="left"/>
-            </w:pPr>
-            <w:r>
-              <w:t xml:space="preserve">0.070* (0.014)</w:t>
+            </w:pPr>
+            <w:r>
+              <w:t xml:space="preserve">0.070 (0.050)</w:t>
             </w:r>
           </w:p>
         </w:tc>
@@ -631,7 +596,6 @@
           <w:p>
             <w:pPr>
               <w:pStyle w:val="Compact"/>
-              <w:jc w:val="left"/>
             </w:pPr>
             <w:r>
               <w:t xml:space="preserve">News_BiasBiasedTowardsInParty</w:t>
@@ -675,22 +639,20 @@
           <w:p>
             <w:pPr>
               <w:pStyle w:val="Compact"/>
-              <w:jc w:val="left"/>
-            </w:pPr>
-            <w:r>
-              <w:t xml:space="preserve">-0.023 (0.061)</w:t>
-            </w:r>
-          </w:p>
-        </w:tc>
-        <w:tc>
-          <w:tcPr/>
-          <w:p>
-            <w:pPr>
-              <w:pStyle w:val="Compact"/>
-              <w:jc w:val="left"/>
-            </w:pPr>
-            <w:r>
-              <w:t xml:space="preserve">0.008 (0.041)</w:t>
+            </w:pPr>
+            <w:r>
+              <w:t xml:space="preserve">-0.023 (0.039)</w:t>
+            </w:r>
+          </w:p>
+        </w:tc>
+        <w:tc>
+          <w:tcPr/>
+          <w:p>
+            <w:pPr>
+              <w:pStyle w:val="Compact"/>
+            </w:pPr>
+            <w:r>
+              <w:t xml:space="preserve">0.008 (0.043)</w:t>
             </w:r>
           </w:p>
         </w:tc>
@@ -701,7 +663,6 @@
           <w:p>
             <w:pPr>
               <w:pStyle w:val="Compact"/>
-              <w:jc w:val="left"/>
             </w:pPr>
             <w:r>
               <w:t xml:space="preserve">News_BiasBiasedTowardsOutParty</w:t>
@@ -745,22 +706,20 @@
           <w:p>
             <w:pPr>
               <w:pStyle w:val="Compact"/>
-              <w:jc w:val="left"/>
-            </w:pPr>
-            <w:r>
-              <w:t xml:space="preserve">-0.138 (0.049)</w:t>
-            </w:r>
-          </w:p>
-        </w:tc>
-        <w:tc>
-          <w:tcPr/>
-          <w:p>
-            <w:pPr>
-              <w:pStyle w:val="Compact"/>
-              <w:jc w:val="left"/>
-            </w:pPr>
-            <w:r>
-              <w:t xml:space="preserve">0.049 (0.020)</w:t>
+            </w:pPr>
+            <w:r>
+              <w:t xml:space="preserve">-0.138*** (0.037)</w:t>
+            </w:r>
+          </w:p>
+        </w:tc>
+        <w:tc>
+          <w:tcPr/>
+          <w:p>
+            <w:pPr>
+              <w:pStyle w:val="Compact"/>
+            </w:pPr>
+            <w:r>
+              <w:t xml:space="preserve">0.049 (0.049)</w:t>
             </w:r>
           </w:p>
         </w:tc>
@@ -771,7 +730,6 @@
           <w:p>
             <w:pPr>
               <w:pStyle w:val="Compact"/>
-              <w:jc w:val="left"/>
             </w:pPr>
             <w:r>
               <w:t xml:space="preserve">Facial_Cuenegative × News_BiasBiasedAgainstInParty</w:t>
@@ -815,22 +773,20 @@
           <w:p>
             <w:pPr>
               <w:pStyle w:val="Compact"/>
-              <w:jc w:val="left"/>
-            </w:pPr>
-            <w:r>
-              <w:t xml:space="preserve">-0.013 (0.005)</w:t>
-            </w:r>
-          </w:p>
-        </w:tc>
-        <w:tc>
-          <w:tcPr/>
-          <w:p>
-            <w:pPr>
-              <w:pStyle w:val="Compact"/>
-              <w:jc w:val="left"/>
-            </w:pPr>
-            <w:r>
-              <w:t xml:space="preserve">-0.068 (0.027)</w:t>
+            </w:pPr>
+            <w:r>
+              <w:t xml:space="preserve">-0.013 (0.059)</w:t>
+            </w:r>
+          </w:p>
+        </w:tc>
+        <w:tc>
+          <w:tcPr/>
+          <w:p>
+            <w:pPr>
+              <w:pStyle w:val="Compact"/>
+            </w:pPr>
+            <w:r>
+              <w:t xml:space="preserve">-0.068 (0.065)</w:t>
             </w:r>
           </w:p>
         </w:tc>
@@ -841,7 +797,6 @@
           <w:p>
             <w:pPr>
               <w:pStyle w:val="Compact"/>
-              <w:jc w:val="left"/>
             </w:pPr>
             <w:r>
               <w:t xml:space="preserve">Facial_Cuepositive × News_BiasBiasedAgainstInParty</w:t>
@@ -885,22 +840,20 @@
           <w:p>
             <w:pPr>
               <w:pStyle w:val="Compact"/>
-              <w:jc w:val="left"/>
-            </w:pPr>
-            <w:r>
-              <w:t xml:space="preserve">0.150 (0.054)</w:t>
-            </w:r>
-          </w:p>
-        </w:tc>
-        <w:tc>
-          <w:tcPr/>
-          <w:p>
-            <w:pPr>
-              <w:pStyle w:val="Compact"/>
-              <w:jc w:val="left"/>
-            </w:pPr>
-            <w:r>
-              <w:t xml:space="preserve">-0.088 (0.065)</w:t>
+            </w:pPr>
+            <w:r>
+              <w:t xml:space="preserve">0.150* (0.058)</w:t>
+            </w:r>
+          </w:p>
+        </w:tc>
+        <w:tc>
+          <w:tcPr/>
+          <w:p>
+            <w:pPr>
+              <w:pStyle w:val="Compact"/>
+            </w:pPr>
+            <w:r>
+              <w:t xml:space="preserve">-0.088 (0.066)</w:t>
             </w:r>
           </w:p>
         </w:tc>
@@ -911,7 +864,6 @@
           <w:p>
             <w:pPr>
               <w:pStyle w:val="Compact"/>
-              <w:jc w:val="left"/>
             </w:pPr>
             <w:r>
               <w:t xml:space="preserve">Facial_Cuenegative × News_BiasBiasedAgainstOutParty</w:t>
@@ -955,22 +907,20 @@
           <w:p>
             <w:pPr>
               <w:pStyle w:val="Compact"/>
-              <w:jc w:val="left"/>
-            </w:pPr>
-            <w:r>
-              <w:t xml:space="preserve">0.075 (0.023)</w:t>
-            </w:r>
-          </w:p>
-        </w:tc>
-        <w:tc>
-          <w:tcPr/>
-          <w:p>
-            <w:pPr>
-              <w:pStyle w:val="Compact"/>
-              <w:jc w:val="left"/>
-            </w:pPr>
-            <w:r>
-              <w:t xml:space="preserve">-0.009 (0.050)</w:t>
+            </w:pPr>
+            <w:r>
+              <w:t xml:space="preserve">0.075 (0.049)</w:t>
+            </w:r>
+          </w:p>
+        </w:tc>
+        <w:tc>
+          <w:tcPr/>
+          <w:p>
+            <w:pPr>
+              <w:pStyle w:val="Compact"/>
+            </w:pPr>
+            <w:r>
+              <w:t xml:space="preserve">-0.009 (0.061)</w:t>
             </w:r>
           </w:p>
         </w:tc>
@@ -981,7 +931,6 @@
           <w:p>
             <w:pPr>
               <w:pStyle w:val="Compact"/>
-              <w:jc w:val="left"/>
             </w:pPr>
             <w:r>
               <w:t xml:space="preserve">Facial_Cuepositive × News_BiasBiasedAgainstOutParty</w:t>
@@ -1025,22 +974,20 @@
           <w:p>
             <w:pPr>
               <w:pStyle w:val="Compact"/>
-              <w:jc w:val="left"/>
-            </w:pPr>
-            <w:r>
-              <w:t xml:space="preserve">-0.068* (0.008)</w:t>
-            </w:r>
-          </w:p>
-        </w:tc>
-        <w:tc>
-          <w:tcPr/>
-          <w:p>
-            <w:pPr>
-              <w:pStyle w:val="Compact"/>
-              <w:jc w:val="left"/>
-            </w:pPr>
-            <w:r>
-              <w:t xml:space="preserve">-0.105 (0.037)</w:t>
+            </w:pPr>
+            <w:r>
+              <w:t xml:space="preserve">-0.068 (0.050)</w:t>
+            </w:r>
+          </w:p>
+        </w:tc>
+        <w:tc>
+          <w:tcPr/>
+          <w:p>
+            <w:pPr>
+              <w:pStyle w:val="Compact"/>
+            </w:pPr>
+            <w:r>
+              <w:t xml:space="preserve">-0.105 (0.060)</w:t>
             </w:r>
           </w:p>
         </w:tc>
@@ -1051,7 +998,6 @@
           <w:p>
             <w:pPr>
               <w:pStyle w:val="Compact"/>
-              <w:jc w:val="left"/>
             </w:pPr>
             <w:r>
               <w:t xml:space="preserve">Facial_Cuenegative × News_BiasBiasedTowardsInParty</w:t>
@@ -1095,22 +1041,20 @@
           <w:p>
             <w:pPr>
               <w:pStyle w:val="Compact"/>
-              <w:jc w:val="left"/>
-            </w:pPr>
-            <w:r>
-              <w:t xml:space="preserve">0.074 (0.026)</w:t>
-            </w:r>
-          </w:p>
-        </w:tc>
-        <w:tc>
-          <w:tcPr/>
-          <w:p>
-            <w:pPr>
-              <w:pStyle w:val="Compact"/>
-              <w:jc w:val="left"/>
-            </w:pPr>
-            <w:r>
-              <w:t xml:space="preserve">0.138 (0.072)</w:t>
+            </w:pPr>
+            <w:r>
+              <w:t xml:space="preserve">0.074 (0.050)</w:t>
+            </w:r>
+          </w:p>
+        </w:tc>
+        <w:tc>
+          <w:tcPr/>
+          <w:p>
+            <w:pPr>
+              <w:pStyle w:val="Compact"/>
+            </w:pPr>
+            <w:r>
+              <w:t xml:space="preserve">0.138* (0.060)</w:t>
             </w:r>
           </w:p>
         </w:tc>
@@ -1121,7 +1065,6 @@
           <w:p>
             <w:pPr>
               <w:pStyle w:val="Compact"/>
-              <w:jc w:val="left"/>
             </w:pPr>
             <w:r>
               <w:t xml:space="preserve">Facial_Cuepositive × News_BiasBiasedTowardsInParty</w:t>
@@ -1165,22 +1108,20 @@
           <w:p>
             <w:pPr>
               <w:pStyle w:val="Compact"/>
-              <w:jc w:val="left"/>
-            </w:pPr>
-            <w:r>
-              <w:t xml:space="preserve">0.015 (0.070)</w:t>
-            </w:r>
-          </w:p>
-        </w:tc>
-        <w:tc>
-          <w:tcPr/>
-          <w:p>
-            <w:pPr>
-              <w:pStyle w:val="Compact"/>
-              <w:jc w:val="left"/>
-            </w:pPr>
-            <w:r>
-              <w:t xml:space="preserve">-0.044 (0.089)</w:t>
+            </w:pPr>
+            <w:r>
+              <w:t xml:space="preserve">0.015 (0.050)</w:t>
+            </w:r>
+          </w:p>
+        </w:tc>
+        <w:tc>
+          <w:tcPr/>
+          <w:p>
+            <w:pPr>
+              <w:pStyle w:val="Compact"/>
+            </w:pPr>
+            <w:r>
+              <w:t xml:space="preserve">-0.044 (0.059)</w:t>
             </w:r>
           </w:p>
         </w:tc>
@@ -1191,7 +1132,6 @@
           <w:p>
             <w:pPr>
               <w:pStyle w:val="Compact"/>
-              <w:jc w:val="left"/>
             </w:pPr>
             <w:r>
               <w:t xml:space="preserve">Facial_Cuenegative × News_BiasBiasedTowardsOutParty</w:t>
@@ -1235,22 +1175,20 @@
           <w:p>
             <w:pPr>
               <w:pStyle w:val="Compact"/>
-              <w:jc w:val="left"/>
-            </w:pPr>
-            <w:r>
-              <w:t xml:space="preserve">0.027 (0.036)</w:t>
-            </w:r>
-          </w:p>
-        </w:tc>
-        <w:tc>
-          <w:tcPr/>
-          <w:p>
-            <w:pPr>
-              <w:pStyle w:val="Compact"/>
-              <w:jc w:val="left"/>
-            </w:pPr>
-            <w:r>
-              <w:t xml:space="preserve">0.006 (0.037)</w:t>
+            </w:pPr>
+            <w:r>
+              <w:t xml:space="preserve">0.027 (0.060)</w:t>
+            </w:r>
+          </w:p>
+        </w:tc>
+        <w:tc>
+          <w:tcPr/>
+          <w:p>
+            <w:pPr>
+              <w:pStyle w:val="Compact"/>
+            </w:pPr>
+            <w:r>
+              <w:t xml:space="preserve">0.006 (0.062)</w:t>
             </w:r>
           </w:p>
         </w:tc>
@@ -1261,7 +1199,6 @@
           <w:p>
             <w:pPr>
               <w:pStyle w:val="Compact"/>
-              <w:jc w:val="left"/>
             </w:pPr>
             <w:r>
               <w:t xml:space="preserve">Facial_Cuepositive × News_BiasBiasedTowardsOutParty</w:t>
@@ -1305,22 +1242,20 @@
           <w:p>
             <w:pPr>
               <w:pStyle w:val="Compact"/>
-              <w:jc w:val="left"/>
-            </w:pPr>
-            <w:r>
-              <w:t xml:space="preserve">0.035 (0.058)</w:t>
-            </w:r>
-          </w:p>
-        </w:tc>
-        <w:tc>
-          <w:tcPr/>
-          <w:p>
-            <w:pPr>
-              <w:pStyle w:val="Compact"/>
-              <w:jc w:val="left"/>
-            </w:pPr>
-            <w:r>
-              <w:t xml:space="preserve">-0.040 (0.023)</w:t>
+            </w:pPr>
+            <w:r>
+              <w:t xml:space="preserve">0.035 (0.054)</w:t>
+            </w:r>
+          </w:p>
+        </w:tc>
+        <w:tc>
+          <w:tcPr/>
+          <w:p>
+            <w:pPr>
+              <w:pStyle w:val="Compact"/>
+            </w:pPr>
+            <w:r>
+              <w:t xml:space="preserve">-0.040 (0.066)</w:t>
             </w:r>
           </w:p>
         </w:tc>
@@ -1331,7 +1266,6 @@
           <w:p>
             <w:pPr>
               <w:pStyle w:val="Compact"/>
-              <w:jc w:val="left"/>
             </w:pPr>
             <w:r>
               <w:t xml:space="preserve">Num.Obs.</w:t>
@@ -1343,7 +1277,6 @@
           <w:p>
             <w:pPr>
               <w:pStyle w:val="Compact"/>
-              <w:jc w:val="left"/>
             </w:pPr>
             <w:r>
               <w:t xml:space="preserve">1242</w:t>
@@ -1355,7 +1288,6 @@
           <w:p>
             <w:pPr>
               <w:pStyle w:val="Compact"/>
-              <w:jc w:val="left"/>
             </w:pPr>
             <w:r>
               <w:t xml:space="preserve">1242</w:t>
@@ -1367,7 +1299,6 @@
           <w:p>
             <w:pPr>
               <w:pStyle w:val="Compact"/>
-              <w:jc w:val="left"/>
             </w:pPr>
             <w:r>
               <w:t xml:space="preserve">984</w:t>
@@ -1379,7 +1310,6 @@
           <w:p>
             <w:pPr>
               <w:pStyle w:val="Compact"/>
-              <w:jc w:val="left"/>
             </w:pPr>
             <w:r>
               <w:t xml:space="preserve">984</w:t>
@@ -1391,7 +1321,6 @@
           <w:p>
             <w:pPr>
               <w:pStyle w:val="Compact"/>
-              <w:jc w:val="left"/>
             </w:pPr>
             <w:r>
               <w:t xml:space="preserve">1072</w:t>
@@ -1403,7 +1332,6 @@
           <w:p>
             <w:pPr>
               <w:pStyle w:val="Compact"/>
-              <w:jc w:val="left"/>
             </w:pPr>
             <w:r>
               <w:t xml:space="preserve">1072</w:t>
@@ -1417,7 +1345,6 @@
           <w:p>
             <w:pPr>
               <w:pStyle w:val="Compact"/>
-              <w:jc w:val="left"/>
             </w:pPr>
             <w:r>
               <w:t xml:space="preserve">R2</w:t>
@@ -1429,7 +1356,6 @@
           <w:p>
             <w:pPr>
               <w:pStyle w:val="Compact"/>
-              <w:jc w:val="left"/>
             </w:pPr>
             <w:r>
               <w:t xml:space="preserve">0.555</w:t>
@@ -1441,7 +1367,6 @@
           <w:p>
             <w:pPr>
               <w:pStyle w:val="Compact"/>
-              <w:jc w:val="left"/>
             </w:pPr>
             <w:r>
               <w:t xml:space="preserve">0.684</w:t>
@@ -1453,7 +1378,6 @@
           <w:p>
             <w:pPr>
               <w:pStyle w:val="Compact"/>
-              <w:jc w:val="left"/>
             </w:pPr>
             <w:r>
               <w:t xml:space="preserve">0.595</w:t>
@@ -1465,7 +1389,6 @@
           <w:p>
             <w:pPr>
               <w:pStyle w:val="Compact"/>
-              <w:jc w:val="left"/>
             </w:pPr>
             <w:r>
               <w:t xml:space="preserve">0.711</w:t>
@@ -1477,7 +1400,6 @@
           <w:p>
             <w:pPr>
               <w:pStyle w:val="Compact"/>
-              <w:jc w:val="left"/>
             </w:pPr>
             <w:r>
               <w:t xml:space="preserve">0.663</w:t>
@@ -1489,7 +1411,6 @@
           <w:p>
             <w:pPr>
               <w:pStyle w:val="Compact"/>
-              <w:jc w:val="left"/>
             </w:pPr>
             <w:r>
               <w:t xml:space="preserve">0.715</w:t>
@@ -1503,7 +1424,6 @@
           <w:p>
             <w:pPr>
               <w:pStyle w:val="Compact"/>
-              <w:jc w:val="left"/>
             </w:pPr>
             <w:r>
               <w:t xml:space="preserve">R2 Adj.</w:t>
@@ -1515,7 +1435,6 @@
           <w:p>
             <w:pPr>
               <w:pStyle w:val="Compact"/>
-              <w:jc w:val="left"/>
             </w:pPr>
             <w:r>
               <w:t xml:space="preserve">0.328</w:t>
@@ -1527,7 +1446,6 @@
           <w:p>
             <w:pPr>
               <w:pStyle w:val="Compact"/>
-              <w:jc w:val="left"/>
             </w:pPr>
             <w:r>
               <w:t xml:space="preserve">0.523</w:t>
@@ -1539,7 +1457,6 @@
           <w:p>
             <w:pPr>
               <w:pStyle w:val="Compact"/>
-              <w:jc w:val="left"/>
             </w:pPr>
             <w:r>
               <w:t xml:space="preserve">0.296</w:t>
@@ -1551,7 +1468,6 @@
           <w:p>
             <w:pPr>
               <w:pStyle w:val="Compact"/>
-              <w:jc w:val="left"/>
             </w:pPr>
             <w:r>
               <w:t xml:space="preserve">0.498</w:t>
@@ -1563,7 +1479,6 @@
           <w:p>
             <w:pPr>
               <w:pStyle w:val="Compact"/>
-              <w:jc w:val="left"/>
             </w:pPr>
             <w:r>
               <w:t xml:space="preserve">0.437</w:t>
@@ -1575,7 +1490,6 @@
           <w:p>
             <w:pPr>
               <w:pStyle w:val="Compact"/>
-              <w:jc w:val="left"/>
             </w:pPr>
             <w:r>
               <w:t xml:space="preserve">0.522</w:t>
@@ -1589,7 +1503,6 @@
           <w:p>
             <w:pPr>
               <w:pStyle w:val="Compact"/>
-              <w:jc w:val="left"/>
             </w:pPr>
             <w:r>
               <w:t xml:space="preserve">AIC</w:t>
@@ -1601,7 +1514,6 @@
           <w:p>
             <w:pPr>
               <w:pStyle w:val="Compact"/>
-              <w:jc w:val="left"/>
             </w:pPr>
             <w:r>
               <w:t xml:space="preserve">-86.0</w:t>
@@ -1613,7 +1525,6 @@
           <w:p>
             <w:pPr>
               <w:pStyle w:val="Compact"/>
-              <w:jc w:val="left"/>
             </w:pPr>
             <w:r>
               <w:t xml:space="preserve">43.2</w:t>
@@ -1625,7 +1536,6 @@
           <w:p>
             <w:pPr>
               <w:pStyle w:val="Compact"/>
-              <w:jc w:val="left"/>
             </w:pPr>
             <w:r>
               <w:t xml:space="preserve">42.7</w:t>
@@ -1637,7 +1547,6 @@
           <w:p>
             <w:pPr>
               <w:pStyle w:val="Compact"/>
-              <w:jc w:val="left"/>
             </w:pPr>
             <w:r>
               <w:t xml:space="preserve">208.8</w:t>
@@ -1649,7 +1558,6 @@
           <w:p>
             <w:pPr>
               <w:pStyle w:val="Compact"/>
-              <w:jc w:val="left"/>
             </w:pPr>
             <w:r>
               <w:t xml:space="preserve">-210.8</w:t>
@@ -1661,7 +1569,6 @@
           <w:p>
             <w:pPr>
               <w:pStyle w:val="Compact"/>
-              <w:jc w:val="left"/>
             </w:pPr>
             <w:r>
               <w:t xml:space="preserve">129.2</w:t>
@@ -1675,7 +1582,6 @@
           <w:p>
             <w:pPr>
               <w:pStyle w:val="Compact"/>
-              <w:jc w:val="left"/>
             </w:pPr>
             <w:r>
               <w:t xml:space="preserve">BIC</w:t>
@@ -1687,7 +1593,6 @@
           <w:p>
             <w:pPr>
               <w:pStyle w:val="Compact"/>
-              <w:jc w:val="left"/>
             </w:pPr>
             <w:r>
               <w:t xml:space="preserve">2071.4</w:t>
@@ -1699,7 +1604,6 @@
           <w:p>
             <w:pPr>
               <w:pStyle w:val="Compact"/>
-              <w:jc w:val="left"/>
             </w:pPr>
             <w:r>
               <w:t xml:space="preserve">2200.6</w:t>
@@ -1711,7 +1615,6 @@
           <w:p>
             <w:pPr>
               <w:pStyle w:val="Compact"/>
-              <w:jc w:val="left"/>
             </w:pPr>
             <w:r>
               <w:t xml:space="preserve">2097.1</w:t>
@@ -1723,7 +1626,6 @@
           <w:p>
             <w:pPr>
               <w:pStyle w:val="Compact"/>
-              <w:jc w:val="left"/>
             </w:pPr>
             <w:r>
               <w:t xml:space="preserve">2263.3</w:t>
@@ -1735,7 +1637,6 @@
           <w:p>
             <w:pPr>
               <w:pStyle w:val="Compact"/>
-              <w:jc w:val="left"/>
             </w:pPr>
             <w:r>
               <w:t xml:space="preserve">1944.4</w:t>
@@ -1747,7 +1648,6 @@
           <w:p>
             <w:pPr>
               <w:pStyle w:val="Compact"/>
-              <w:jc w:val="left"/>
             </w:pPr>
             <w:r>
               <w:t xml:space="preserve">2284.4</w:t>
@@ -1761,7 +1661,6 @@
           <w:p>
             <w:pPr>
               <w:pStyle w:val="Compact"/>
-              <w:jc w:val="left"/>
             </w:pPr>
             <w:r>
               <w:t xml:space="preserve">RMSE</w:t>
@@ -1773,7 +1672,6 @@
           <w:p>
             <w:pPr>
               <w:pStyle w:val="Compact"/>
-              <w:jc w:val="left"/>
             </w:pPr>
             <w:r>
               <w:t xml:space="preserve">0.17</w:t>
@@ -1785,7 +1683,6 @@
           <w:p>
             <w:pPr>
               <w:pStyle w:val="Compact"/>
-              <w:jc w:val="left"/>
             </w:pPr>
             <w:r>
               <w:t xml:space="preserve">0.18</w:t>
@@ -1797,7 +1694,6 @@
           <w:p>
             <w:pPr>
               <w:pStyle w:val="Compact"/>
-              <w:jc w:val="left"/>
             </w:pPr>
             <w:r>
               <w:t xml:space="preserve">0.16</w:t>
@@ -1809,7 +1705,6 @@
           <w:p>
             <w:pPr>
               <w:pStyle w:val="Compact"/>
-              <w:jc w:val="left"/>
             </w:pPr>
             <w:r>
               <w:t xml:space="preserve">0.18</w:t>
@@ -1821,7 +1716,6 @@
           <w:p>
             <w:pPr>
               <w:pStyle w:val="Compact"/>
-              <w:jc w:val="left"/>
             </w:pPr>
             <w:r>
               <w:t xml:space="preserve">0.15</w:t>
@@ -1833,7 +1727,6 @@
           <w:p>
             <w:pPr>
               <w:pStyle w:val="Compact"/>
-              <w:jc w:val="left"/>
             </w:pPr>
             <w:r>
               <w:t xml:space="preserve">0.17</w:t>
@@ -1847,7 +1740,6 @@
           <w:p>
             <w:pPr>
               <w:pStyle w:val="Compact"/>
-              <w:jc w:val="left"/>
             </w:pPr>
             <w:r>
               <w:t xml:space="preserve">Std.Errors</w:t>
@@ -1859,70 +1751,64 @@
           <w:p>
             <w:pPr>
               <w:pStyle w:val="Compact"/>
-              <w:jc w:val="left"/>
-            </w:pPr>
-            <w:r>
-              <w:t xml:space="preserve">by: Batch</w:t>
-            </w:r>
-          </w:p>
-        </w:tc>
-        <w:tc>
-          <w:tcPr/>
-          <w:p>
-            <w:pPr>
-              <w:pStyle w:val="Compact"/>
-              <w:jc w:val="left"/>
-            </w:pPr>
-            <w:r>
-              <w:t xml:space="preserve">by: Batch</w:t>
-            </w:r>
-          </w:p>
-        </w:tc>
-        <w:tc>
-          <w:tcPr/>
-          <w:p>
-            <w:pPr>
-              <w:pStyle w:val="Compact"/>
-              <w:jc w:val="left"/>
-            </w:pPr>
-            <w:r>
-              <w:t xml:space="preserve">by: Batch</w:t>
-            </w:r>
-          </w:p>
-        </w:tc>
-        <w:tc>
-          <w:tcPr/>
-          <w:p>
-            <w:pPr>
-              <w:pStyle w:val="Compact"/>
-              <w:jc w:val="left"/>
-            </w:pPr>
-            <w:r>
-              <w:t xml:space="preserve">by: Batch</w:t>
-            </w:r>
-          </w:p>
-        </w:tc>
-        <w:tc>
-          <w:tcPr/>
-          <w:p>
-            <w:pPr>
-              <w:pStyle w:val="Compact"/>
-              <w:jc w:val="left"/>
-            </w:pPr>
-            <w:r>
-              <w:t xml:space="preserve">by: Batch</w:t>
-            </w:r>
-          </w:p>
-        </w:tc>
-        <w:tc>
-          <w:tcPr/>
-          <w:p>
-            <w:pPr>
-              <w:pStyle w:val="Compact"/>
-              <w:jc w:val="left"/>
-            </w:pPr>
-            <w:r>
-              <w:t xml:space="preserve">by: Batch</w:t>
+            </w:pPr>
+            <w:r>
+              <w:t xml:space="preserve">by: PID</w:t>
+            </w:r>
+          </w:p>
+        </w:tc>
+        <w:tc>
+          <w:tcPr/>
+          <w:p>
+            <w:pPr>
+              <w:pStyle w:val="Compact"/>
+            </w:pPr>
+            <w:r>
+              <w:t xml:space="preserve">by: PID</w:t>
+            </w:r>
+          </w:p>
+        </w:tc>
+        <w:tc>
+          <w:tcPr/>
+          <w:p>
+            <w:pPr>
+              <w:pStyle w:val="Compact"/>
+            </w:pPr>
+            <w:r>
+              <w:t xml:space="preserve">by: PID</w:t>
+            </w:r>
+          </w:p>
+        </w:tc>
+        <w:tc>
+          <w:tcPr/>
+          <w:p>
+            <w:pPr>
+              <w:pStyle w:val="Compact"/>
+            </w:pPr>
+            <w:r>
+              <w:t xml:space="preserve">by: PID</w:t>
+            </w:r>
+          </w:p>
+        </w:tc>
+        <w:tc>
+          <w:tcPr/>
+          <w:p>
+            <w:pPr>
+              <w:pStyle w:val="Compact"/>
+            </w:pPr>
+            <w:r>
+              <w:t xml:space="preserve">by: PID</w:t>
+            </w:r>
+          </w:p>
+        </w:tc>
+        <w:tc>
+          <w:tcPr/>
+          <w:p>
+            <w:pPr>
+              <w:pStyle w:val="Compact"/>
+            </w:pPr>
+            <w:r>
+              <w:t xml:space="preserve">by: PID</w:t>
             </w:r>
           </w:p>
         </w:tc>
@@ -1935,7 +1821,6 @@
           <w:p>
             <w:pPr>
               <w:pStyle w:val="Compact"/>
-              <w:jc w:val="left"/>
             </w:pPr>
             <w:r>
               <w:t xml:space="preserve">p-values: * &lt; 0.05 ** &lt; 0.01 *** &lt; 0.001</w:t>
@@ -1944,7 +1829,11 @@
         </w:tc>
       </w:tr>
     </w:tbl>
-    <w:sectPr/>
+    <w:sectPr>
+      <w:footnotePr>
+        <w:numRestart w:val="eachSect"/>
+      </w:footnotePr>
+    </w:sectPr>
   </w:body>
 </w:document>
 </file>
@@ -2061,10 +1950,10 @@
   <w:docDefaults>
     <w:rPrDefault>
       <w:rPr>
-        <w:rFonts w:asciiTheme="minorHAnsi" w:cstheme="minorBidi" w:eastAsiaTheme="minorHAnsi" w:hAnsiTheme="minorHAnsi"/>
+        <w:rFonts w:asciiTheme="minorHAnsi" w:cstheme="minorBidi" w:eastAsiaTheme="minorEastAsia" w:hAnsiTheme="minorHAnsi"/>
         <w:sz w:val="24"/>
         <w:szCs w:val="24"/>
-        <w:lang w:bidi="ar-SA" w:eastAsia="en-US" w:val="en-US"/>
+        <w:lang w:bidi="ar-SA" w:eastAsia="zh-CN" w:val="en-US"/>
       </w:rPr>
     </w:rPrDefault>
     <w:pPrDefault>
@@ -2116,8 +2005,6 @@
     </w:pPr>
     <w:rPr>
       <w:rFonts w:asciiTheme="majorHAnsi" w:cstheme="majorBidi" w:eastAsiaTheme="majorEastAsia" w:hAnsiTheme="majorHAnsi"/>
-      <w:spacing w:val="-10"/>
-      <w:kern w:val="28"/>
       <w:sz w:val="56"/>
       <w:szCs w:val="56"/>
     </w:rPr>
@@ -2130,15 +2017,13 @@
     <w:rsid w:val="00A10FD9"/>
     <w:rPr>
       <w:rFonts w:asciiTheme="majorHAnsi" w:cstheme="majorBidi" w:eastAsiaTheme="majorEastAsia" w:hAnsiTheme="majorHAnsi"/>
-      <w:spacing w:val="-10"/>
-      <w:kern w:val="28"/>
       <w:sz w:val="56"/>
       <w:szCs w:val="56"/>
     </w:rPr>
   </w:style>
   <w:style w:styleId="Subtitle" w:type="paragraph">
     <w:name w:val="Subtitle"/>
-    <w:basedOn w:val="Normal"/>
+    <w:basedOn w:val="Title"/>
     <w:next w:val="BodyText"/>
     <w:link w:val="SubtitleChar"/>
     <w:uiPriority w:val="11"/>
@@ -2151,7 +2036,6 @@
     </w:pPr>
     <w:rPr>
       <w:rFonts w:cstheme="majorBidi" w:eastAsiaTheme="majorEastAsia"/>
-      <w:color w:themeColor="text1" w:themeTint="A6" w:val="595959"/>
       <w:spacing w:val="15"/>
       <w:sz w:val="28"/>
       <w:szCs w:val="28"/>
@@ -2173,23 +2057,31 @@
   </w:style>
   <w:style w:customStyle="1" w:styleId="Author" w:type="paragraph">
     <w:name w:val="Author"/>
+    <w:basedOn w:val="Title"/>
     <w:next w:val="BodyText"/>
     <w:qFormat/>
     <w:pPr>
       <w:keepNext/>
       <w:keepLines/>
-      <w:jc w:val="center"/>
     </w:pPr>
+    <w:rPr>
+      <w:sz w:val="24"/>
+      <w:szCs w:val="24"/>
+    </w:rPr>
   </w:style>
   <w:style w:styleId="Date" w:type="paragraph">
     <w:name w:val="Date"/>
+    <w:basedOn w:val="Title"/>
     <w:next w:val="BodyText"/>
     <w:qFormat/>
     <w:pPr>
       <w:keepNext/>
       <w:keepLines/>
-      <w:jc w:val="center"/>
     </w:pPr>
+    <w:rPr>
+      <w:sz w:val="24"/>
+      <w:szCs w:val="24"/>
+    </w:rPr>
   </w:style>
   <w:style w:customStyle="1" w:styleId="AbstractTitle" w:type="paragraph">
     <w:name w:val="Abstract Title"/>
@@ -2204,7 +2096,6 @@
     </w:pPr>
     <w:rPr>
       <w:b/>
-      <w:color w:val="345A8A"/>
       <w:sz w:val="20"/>
       <w:szCs w:val="20"/>
     </w:rPr>
@@ -2603,13 +2494,6 @@
       </w:tblCellMar>
     </w:tblPr>
     <w:tblStylePr w:type="firstRow">
-      <w:tblPr>
-        <w:jc w:val="left"/>
-        <w:tblInd w:type="dxa" w:w="0"/>
-      </w:tblPr>
-      <w:trPr>
-        <w:jc w:val="left"/>
-      </w:trPr>
       <w:tcPr>
         <w:tcBorders>
           <w:bottom w:val="single"/>

</xml_diff>